<commit_message>
Deploying to gh-pages from @ Morrison-Lab/psw@80f8c5428664f81c979f4f011f308ca71a754551 🚀
</commit_message>
<xml_diff>
--- a/chapters/inclusive-writing.docx
+++ b/chapters/inclusive-writing.docx
@@ -15,7 +15,7 @@
         <w:pStyle w:val="Date"/>
       </w:pPr>
       <w:r>
-        <w:t xml:space="preserve">Last modified: 2026-10-13 17:50:10 (PDT)</w:t>
+        <w:t xml:space="preserve">Last modified: 2026-10-13 17:55:03 (PDT)</w:t>
       </w:r>
     </w:p>
     <w:tbl>
@@ -1518,13 +1518,13 @@
       </w:r>
     </w:p>
     <w:bookmarkEnd w:id="18"/>
-    <w:bookmarkStart w:id="19" w:name="write-positive-statements"/>
+    <w:bookmarkStart w:id="19" w:name="introduce-shorthand-before-using-it"/>
     <w:p>
       <w:pPr>
         <w:pStyle w:val="Heading2"/>
       </w:pPr>
       <w:r>
-        <w:t xml:space="preserve">5 Write positive statements</w:t>
+        <w:t xml:space="preserve">5 Introduce shorthand before using it</w:t>
       </w:r>
     </w:p>
     <w:p>
@@ -1532,6 +1532,186 @@
         <w:pStyle w:val="FirstParagraph"/>
       </w:pPr>
       <w:r>
+        <w:t xml:space="preserve">Introduce every shorthand before its first use.</w:t>
+      </w:r>
+      <w:r>
+        <w:t xml:space="preserve"> </w:t>
+      </w:r>
+      <w:r>
+        <w:t xml:space="preserve">This covers abbreviations and also shortened phrases,</w:t>
+      </w:r>
+      <w:r>
+        <w:t xml:space="preserve"> </w:t>
+      </w:r>
+      <w:r>
+        <w:t xml:space="preserve">such as</w:t>
+      </w:r>
+      <w:r>
+        <w:t xml:space="preserve"> </w:t>
+      </w:r>
+      <w:r>
+        <w:t xml:space="preserve">“objective”</w:t>
+      </w:r>
+      <w:r>
+        <w:t xml:space="preserve"> </w:t>
+      </w:r>
+      <w:r>
+        <w:t xml:space="preserve">for</w:t>
+      </w:r>
+      <w:r>
+        <w:t xml:space="preserve"> </w:t>
+      </w:r>
+      <w:r>
+        <w:t xml:space="preserve">“objective function”</w:t>
+      </w:r>
+      <w:r>
+        <w:t xml:space="preserve">.</w:t>
+      </w:r>
+      <w:r>
+        <w:t xml:space="preserve"> </w:t>
+      </w:r>
+      <w:r>
+        <w:t xml:space="preserve">Give the full term first and mark the short form,</w:t>
+      </w:r>
+      <w:r>
+        <w:t xml:space="preserve"> </w:t>
+      </w:r>
+      <w:r>
+        <w:t xml:space="preserve">for example</w:t>
+      </w:r>
+      <w:r>
+        <w:t xml:space="preserve"> </w:t>
+      </w:r>
+      <w:r>
+        <w:t xml:space="preserve">“an</w:t>
+      </w:r>
+      <w:r>
+        <w:t xml:space="preserve"> </w:t>
+      </w:r>
+      <w:r>
+        <w:rPr>
+          <w:i/>
+          <w:iCs/>
+        </w:rPr>
+        <w:t xml:space="preserve">objective function</w:t>
+      </w:r>
+      <w:r>
+        <w:t xml:space="preserve">, or</w:t>
+      </w:r>
+      <w:r>
+        <w:t xml:space="preserve"> </w:t>
+      </w:r>
+      <w:r>
+        <w:rPr>
+          <w:i/>
+          <w:iCs/>
+        </w:rPr>
+        <w:t xml:space="preserve">objective</w:t>
+      </w:r>
+      <w:r>
+        <w:t xml:space="preserve"> </w:t>
+      </w:r>
+      <w:r>
+        <w:t xml:space="preserve">for short”</w:t>
+      </w:r>
+      <w:r>
+        <w:t xml:space="preserve">.</w:t>
+      </w:r>
+      <w:r>
+        <w:t xml:space="preserve"> </w:t>
+      </w:r>
+      <w:r>
+        <w:t xml:space="preserve">Then use the short form consistently.</w:t>
+      </w:r>
+    </w:p>
+    <w:p>
+      <w:pPr>
+        <w:pStyle w:val="BlockText"/>
+      </w:pPr>
+      <w:r>
+        <w:t xml:space="preserve">❌ The objective as a function of the parameters is a paraboloid.</w:t>
+      </w:r>
+      <w:r>
+        <w:t xml:space="preserve"> </w:t>
+      </w:r>
+      <w:r>
+        <w:t xml:space="preserve">An</w:t>
+      </w:r>
+      <w:r>
+        <w:t xml:space="preserve"> </w:t>
+      </w:r>
+      <w:r>
+        <w:rPr>
+          <w:i/>
+          <w:iCs/>
+        </w:rPr>
+        <w:t xml:space="preserve">objective function</w:t>
+      </w:r>
+      <w:r>
+        <w:t xml:space="preserve"> </w:t>
+      </w:r>
+      <w:r>
+        <w:t xml:space="preserve">is the quantity we minimize.</w:t>
+      </w:r>
+    </w:p>
+    <w:p>
+      <w:pPr>
+        <w:pStyle w:val="BlockText"/>
+      </w:pPr>
+      <w:r>
+        <w:t xml:space="preserve">✅ An</w:t>
+      </w:r>
+      <w:r>
+        <w:t xml:space="preserve"> </w:t>
+      </w:r>
+      <w:r>
+        <w:rPr>
+          <w:i/>
+          <w:iCs/>
+        </w:rPr>
+        <w:t xml:space="preserve">objective function</w:t>
+      </w:r>
+      <w:r>
+        <w:t xml:space="preserve">, or</w:t>
+      </w:r>
+      <w:r>
+        <w:t xml:space="preserve"> </w:t>
+      </w:r>
+      <w:r>
+        <w:rPr>
+          <w:i/>
+          <w:iCs/>
+        </w:rPr>
+        <w:t xml:space="preserve">objective</w:t>
+      </w:r>
+      <w:r>
+        <w:t xml:space="preserve"> </w:t>
+      </w:r>
+      <w:r>
+        <w:t xml:space="preserve">for short, is the quantity we minimize.</w:t>
+      </w:r>
+      <w:r>
+        <w:t xml:space="preserve"> </w:t>
+      </w:r>
+      <w:r>
+        <w:t xml:space="preserve">The objective as a function of the parameters is a paraboloid.</w:t>
+      </w:r>
+    </w:p>
+    <w:bookmarkEnd w:id="19"/>
+    <w:bookmarkStart w:id="20" w:name="write-positive-statements"/>
+    <w:p>
+      <w:pPr>
+        <w:pStyle w:val="Heading2"/>
+      </w:pPr>
+      <w:r>
+        <w:t xml:space="preserve">6 Write positive statements</w:t>
+      </w:r>
+    </w:p>
+    <w:p>
+      <w:pPr>
+        <w:pStyle w:val="FirstParagraph"/>
+      </w:pPr>
+      <w:r>
         <w:t xml:space="preserve">State what is true, not what is not false.</w:t>
       </w:r>
       <w:r>
@@ -1617,14 +1797,14 @@
         <w:t xml:space="preserve">✅ We reject the null hypothesis when the p-value is 0.05 or less.</w:t>
       </w:r>
     </w:p>
-    <w:bookmarkEnd w:id="19"/>
-    <w:bookmarkStart w:id="20" w:name="rewrite-noun-strings-and-hidden-verbs"/>
+    <w:bookmarkEnd w:id="20"/>
+    <w:bookmarkStart w:id="21" w:name="rewrite-noun-strings-and-hidden-verbs"/>
     <w:p>
       <w:pPr>
         <w:pStyle w:val="Heading2"/>
       </w:pPr>
       <w:r>
-        <w:t xml:space="preserve">6 Rewrite noun strings and hidden verbs</w:t>
+        <w:t xml:space="preserve">7 Rewrite noun strings and hidden verbs</w:t>
       </w:r>
     </w:p>
     <w:p>
@@ -1809,14 +1989,14 @@
         <w:t xml:space="preserve">✅ We evaluated how accurately the model predicts.</w:t>
       </w:r>
     </w:p>
-    <w:bookmarkEnd w:id="20"/>
-    <w:bookmarkStart w:id="23" w:name="put-one-idea-in-each-sentence"/>
+    <w:bookmarkEnd w:id="21"/>
+    <w:bookmarkStart w:id="24" w:name="put-one-idea-in-each-sentence"/>
     <w:p>
       <w:pPr>
         <w:pStyle w:val="Heading2"/>
       </w:pPr>
       <w:r>
-        <w:t xml:space="preserve">7 Put one idea in each sentence</w:t>
+        <w:t xml:space="preserve">8 Put one idea in each sentence</w:t>
       </w:r>
     </w:p>
     <w:p>
@@ -1995,7 +2175,7 @@
       <w:pPr>
         <w:pStyle w:val="FirstParagraph"/>
       </w:pPr>
-      <w:hyperlink r:id="rId21">
+      <w:hyperlink r:id="rId22">
         <w:r>
           <w:rPr>
             <w:rStyle w:val="Hyperlink"/>
@@ -2012,7 +2192,7 @@
       <w:r>
         <w:t xml:space="preserve"> </w:t>
       </w:r>
-      <w:hyperlink r:id="rId22">
+      <w:hyperlink r:id="rId23">
         <w:r>
           <w:rPr>
             <w:rStyle w:val="Hyperlink"/>
@@ -2027,14 +2207,14 @@
         <w:t xml:space="preserve">give more examples.</w:t>
       </w:r>
     </w:p>
-    <w:bookmarkEnd w:id="23"/>
-    <w:bookmarkStart w:id="25" w:name="state-every-step-and-every-point"/>
+    <w:bookmarkEnd w:id="24"/>
+    <w:bookmarkStart w:id="26" w:name="state-every-step-and-every-point"/>
     <w:p>
       <w:pPr>
         <w:pStyle w:val="Heading2"/>
       </w:pPr>
       <w:r>
-        <w:t xml:space="preserve">8 State every step and every point</w:t>
+        <w:t xml:space="preserve">9 State every step and every point</w:t>
       </w:r>
     </w:p>
     <w:p>
@@ -2170,7 +2350,7 @@
       <w:r>
         <w:t xml:space="preserve"> </w:t>
       </w:r>
-      <w:hyperlink r:id="rId24">
+      <w:hyperlink r:id="rId25">
         <w:r>
           <w:rPr>
             <w:rStyle w:val="Hyperlink"/>
@@ -2185,14 +2365,14 @@
         <w:t xml:space="preserve">explains what to write instead.</w:t>
       </w:r>
     </w:p>
-    <w:bookmarkEnd w:id="25"/>
-    <w:bookmarkStart w:id="27" w:name="say-what-numbers-and-symbols-mean"/>
+    <w:bookmarkEnd w:id="26"/>
+    <w:bookmarkStart w:id="28" w:name="say-what-numbers-and-symbols-mean"/>
     <w:p>
       <w:pPr>
         <w:pStyle w:val="Heading2"/>
       </w:pPr>
       <w:r>
-        <w:t xml:space="preserve">9 Say what numbers and symbols mean</w:t>
+        <w:t xml:space="preserve">10 Say what numbers and symbols mean</w:t>
       </w:r>
     </w:p>
     <w:p>
@@ -2669,7 +2849,7 @@
       <w:r>
         <w:t xml:space="preserve"> </w:t>
       </w:r>
-      <w:hyperlink r:id="rId26">
+      <w:hyperlink r:id="rId27">
         <w:r>
           <w:rPr>
             <w:rStyle w:val="Hyperlink"/>
@@ -2684,14 +2864,14 @@
         <w:t xml:space="preserve">chapter has more rules for notation.</w:t>
       </w:r>
     </w:p>
-    <w:bookmarkEnd w:id="27"/>
-    <w:bookmarkStart w:id="28" w:name="use-examples-that-every-reader-knows"/>
+    <w:bookmarkEnd w:id="28"/>
+    <w:bookmarkStart w:id="29" w:name="use-examples-that-every-reader-knows"/>
     <w:p>
       <w:pPr>
         <w:pStyle w:val="Heading2"/>
       </w:pPr>
       <w:r>
-        <w:t xml:space="preserve">10 Use examples that every reader knows</w:t>
+        <w:t xml:space="preserve">11 Use examples that every reader knows</w:t>
       </w:r>
     </w:p>
     <w:p>
@@ -2838,14 +3018,14 @@
         <w:t xml:space="preserve">✅ Each student submits their code by Friday.</w:t>
       </w:r>
     </w:p>
-    <w:bookmarkEnd w:id="28"/>
-    <w:bookmarkStart w:id="31" w:name="keep-a-predictable-structure"/>
+    <w:bookmarkEnd w:id="29"/>
+    <w:bookmarkStart w:id="32" w:name="keep-a-predictable-structure"/>
     <w:p>
       <w:pPr>
         <w:pStyle w:val="Heading2"/>
       </w:pPr>
       <w:r>
-        <w:t xml:space="preserve">11 Keep a predictable structure</w:t>
+        <w:t xml:space="preserve">12 Keep a predictable structure</w:t>
       </w:r>
     </w:p>
     <w:p>
@@ -3032,7 +3212,7 @@
       <w:pPr>
         <w:pStyle w:val="FirstParagraph"/>
       </w:pPr>
-      <w:hyperlink r:id="rId29">
+      <w:hyperlink r:id="rId30">
         <w:r>
           <w:rPr>
             <w:rStyle w:val="Hyperlink"/>
@@ -3049,7 +3229,7 @@
       <w:r>
         <w:t xml:space="preserve"> </w:t>
       </w:r>
-      <w:hyperlink r:id="rId30">
+      <w:hyperlink r:id="rId31">
         <w:r>
           <w:rPr>
             <w:rStyle w:val="Hyperlink"/>
@@ -3070,14 +3250,14 @@
         <w:t xml:space="preserve">cover lists and headings in more detail.</w:t>
       </w:r>
     </w:p>
-    <w:bookmarkEnd w:id="31"/>
-    <w:bookmarkStart w:id="32" w:name="present-ideas-in-more-than-one-form"/>
+    <w:bookmarkEnd w:id="32"/>
+    <w:bookmarkStart w:id="33" w:name="present-ideas-in-more-than-one-form"/>
     <w:p>
       <w:pPr>
         <w:pStyle w:val="Heading2"/>
       </w:pPr>
       <w:r>
-        <w:t xml:space="preserve">12 Present ideas in more than one form</w:t>
+        <w:t xml:space="preserve">13 Present ideas in more than one form</w:t>
       </w:r>
     </w:p>
     <w:p>
@@ -3218,14 +3398,14 @@
         <w:t xml:space="preserve">so that a reader who cannot see it gets the same information.</w:t>
       </w:r>
     </w:p>
-    <w:bookmarkEnd w:id="32"/>
-    <w:bookmarkStart w:id="46" w:name="test-your-writing-with-a-reader"/>
+    <w:bookmarkEnd w:id="33"/>
+    <w:bookmarkStart w:id="47" w:name="test-your-writing-with-a-reader"/>
     <w:p>
       <w:pPr>
         <w:pStyle w:val="Heading2"/>
       </w:pPr>
       <w:r>
-        <w:t xml:space="preserve">13 Test your writing with a reader</w:t>
+        <w:t xml:space="preserve">14 Test your writing with a reader</w:t>
       </w:r>
     </w:p>
     <w:p>
@@ -3331,8 +3511,8 @@
         <w:t xml:space="preserve">rewrite that paragraph.</w:t>
       </w:r>
     </w:p>
-    <w:bookmarkStart w:id="45" w:name="refs"/>
-    <w:bookmarkStart w:id="34" w:name="ref-cdc_ccindex"/>
+    <w:bookmarkStart w:id="46" w:name="refs"/>
+    <w:bookmarkStart w:id="35" w:name="ref-cdc_ccindex"/>
     <w:p>
       <w:pPr>
         <w:pStyle w:val="Bibliography"/>
@@ -3370,7 +3550,7 @@
       <w:r>
         <w:t xml:space="preserve"> </w:t>
       </w:r>
-      <w:hyperlink r:id="rId33">
+      <w:hyperlink r:id="rId34">
         <w:r>
           <w:rPr>
             <w:rStyle w:val="Hyperlink"/>
@@ -3382,8 +3562,8 @@
         <w:t xml:space="preserve">.</w:t>
       </w:r>
     </w:p>
-    <w:bookmarkEnd w:id="34"/>
-    <w:bookmarkStart w:id="36" w:name="ref-cornell_udl"/>
+    <w:bookmarkEnd w:id="35"/>
+    <w:bookmarkStart w:id="37" w:name="ref-cornell_udl"/>
     <w:p>
       <w:pPr>
         <w:pStyle w:val="Bibliography"/>
@@ -3407,7 +3587,7 @@
       <w:r>
         <w:t xml:space="preserve"> </w:t>
       </w:r>
-      <w:hyperlink r:id="rId35">
+      <w:hyperlink r:id="rId36">
         <w:r>
           <w:rPr>
             <w:rStyle w:val="Hyperlink"/>
@@ -3419,8 +3599,8 @@
         <w:t xml:space="preserve">.</w:t>
       </w:r>
     </w:p>
-    <w:bookmarkEnd w:id="36"/>
-    <w:bookmarkStart w:id="38" w:name="ref-github_docs_style"/>
+    <w:bookmarkEnd w:id="37"/>
+    <w:bookmarkStart w:id="39" w:name="ref-github_docs_style"/>
     <w:p>
       <w:pPr>
         <w:pStyle w:val="Bibliography"/>
@@ -3444,7 +3624,7 @@
       <w:r>
         <w:t xml:space="preserve"> </w:t>
       </w:r>
-      <w:hyperlink r:id="rId37">
+      <w:hyperlink r:id="rId38">
         <w:r>
           <w:rPr>
             <w:rStyle w:val="Hyperlink"/>
@@ -3456,8 +3636,8 @@
         <w:t xml:space="preserve">.</w:t>
       </w:r>
     </w:p>
-    <w:bookmarkEnd w:id="38"/>
-    <w:bookmarkStart w:id="40" w:name="ref-github_docs_translation"/>
+    <w:bookmarkEnd w:id="39"/>
+    <w:bookmarkStart w:id="41" w:name="ref-github_docs_translation"/>
     <w:p>
       <w:pPr>
         <w:pStyle w:val="Bibliography"/>
@@ -3481,7 +3661,7 @@
       <w:r>
         <w:t xml:space="preserve"> </w:t>
       </w:r>
-      <w:hyperlink r:id="rId39">
+      <w:hyperlink r:id="rId40">
         <w:r>
           <w:rPr>
             <w:rStyle w:val="Hyperlink"/>
@@ -3493,8 +3673,8 @@
         <w:t xml:space="preserve">.</w:t>
       </w:r>
     </w:p>
-    <w:bookmarkEnd w:id="40"/>
-    <w:bookmarkStart w:id="42" w:name="ref-plainlanguage_gov"/>
+    <w:bookmarkEnd w:id="41"/>
+    <w:bookmarkStart w:id="43" w:name="ref-plainlanguage_gov"/>
     <w:p>
       <w:pPr>
         <w:pStyle w:val="Bibliography"/>
@@ -3518,7 +3698,7 @@
       <w:r>
         <w:t xml:space="preserve"> </w:t>
       </w:r>
-      <w:hyperlink r:id="rId41">
+      <w:hyperlink r:id="rId42">
         <w:r>
           <w:rPr>
             <w:rStyle w:val="Hyperlink"/>
@@ -3530,8 +3710,8 @@
         <w:t xml:space="preserve">.</w:t>
       </w:r>
     </w:p>
-    <w:bookmarkEnd w:id="42"/>
-    <w:bookmarkStart w:id="44" w:name="ref-w3c_coga"/>
+    <w:bookmarkEnd w:id="43"/>
+    <w:bookmarkStart w:id="45" w:name="ref-w3c_coga"/>
     <w:p>
       <w:pPr>
         <w:pStyle w:val="Bibliography"/>
@@ -3555,7 +3735,7 @@
       <w:r>
         <w:t xml:space="preserve"> </w:t>
       </w:r>
-      <w:hyperlink r:id="rId43">
+      <w:hyperlink r:id="rId44">
         <w:r>
           <w:rPr>
             <w:rStyle w:val="Hyperlink"/>
@@ -3567,9 +3747,9 @@
         <w:t xml:space="preserve">.</w:t>
       </w:r>
     </w:p>
-    <w:bookmarkEnd w:id="44"/>
     <w:bookmarkEnd w:id="45"/>
     <w:bookmarkEnd w:id="46"/>
+    <w:bookmarkEnd w:id="47"/>
     <w:sectPr>
       <w:footnotePr>
         <w:numRestart w:val="eachSect"/>

</xml_diff>

<commit_message>
Deploying to gh-pages from @ Morrison-Lab/psw@0c757b33dc6a4de485e96e73c5ab78a6c295e4c0 🚀
</commit_message>
<xml_diff>
--- a/chapters/inclusive-writing.docx
+++ b/chapters/inclusive-writing.docx
@@ -15,7 +15,7 @@
         <w:pStyle w:val="Date"/>
       </w:pPr>
       <w:r>
-        <w:t xml:space="preserve">Last modified: 2026-10-18 11:25:03 (PDT)</w:t>
+        <w:t xml:space="preserve">Last modified: 2026-10-18 11:31:22 (PDT)</w:t>
       </w:r>
     </w:p>
     <w:tbl>
@@ -2221,6 +2221,102 @@
       </w:r>
       <w:r>
         <w:t xml:space="preserve">is larger.</w:t>
+      </w:r>
+    </w:p>
+    <w:p>
+      <w:pPr>
+        <w:pStyle w:val="FirstParagraph"/>
+      </w:pPr>
+      <w:r>
+        <w:t xml:space="preserve">A sentence that states a result and then adds</w:t>
+      </w:r>
+      <w:r>
+        <w:t xml:space="preserve"> </w:t>
+      </w:r>
+      <w:r>
+        <w:t xml:space="preserve">“which”</w:t>
+      </w:r>
+      <w:r>
+        <w:t xml:space="preserve"> </w:t>
+      </w:r>
+      <w:r>
+        <w:t xml:space="preserve">and</w:t>
+      </w:r>
+      <w:r>
+        <w:t xml:space="preserve"> </w:t>
+      </w:r>
+      <w:r>
+        <w:t xml:space="preserve">“and”</w:t>
+      </w:r>
+      <w:r>
+        <w:t xml:space="preserve"> </w:t>
+      </w:r>
+      <w:r>
+        <w:t xml:space="preserve">clauses about it</w:t>
+      </w:r>
+      <w:r>
+        <w:t xml:space="preserve"> </w:t>
+      </w:r>
+      <w:r>
+        <w:t xml:space="preserve">also holds several points.</w:t>
+      </w:r>
+      <w:r>
+        <w:t xml:space="preserve"> </w:t>
+      </w:r>
+      <w:r>
+        <w:t xml:space="preserve">Give each fact its own sentence, in the order a reader needs them.</w:t>
+      </w:r>
+    </w:p>
+    <w:p>
+      <w:pPr>
+        <w:pStyle w:val="BlockText"/>
+      </w:pPr>
+      <w:r>
+        <w:t xml:space="preserve">❌ The constant prediction has squared-error risk 5,</w:t>
+      </w:r>
+      <w:r>
+        <w:t xml:space="preserve"> </w:t>
+      </w:r>
+      <w:r>
+        <w:t xml:space="preserve">which is larger than the risk 1 of the conditional mean,</w:t>
+      </w:r>
+      <w:r>
+        <w:t xml:space="preserve"> </w:t>
+      </w:r>
+      <w:r>
+        <w:t xml:space="preserve">and strictly so because the two predictions differ.</w:t>
+      </w:r>
+    </w:p>
+    <w:p>
+      <w:pPr>
+        <w:pStyle w:val="BlockText"/>
+      </w:pPr>
+      <w:r>
+        <w:t xml:space="preserve">✅ Consider the constant prediction.</w:t>
+      </w:r>
+      <w:r>
+        <w:t xml:space="preserve"> </w:t>
+      </w:r>
+      <w:r>
+        <w:t xml:space="preserve">Its squared-error risk is 5.</w:t>
+      </w:r>
+      <w:r>
+        <w:t xml:space="preserve"> </w:t>
+      </w:r>
+      <w:r>
+        <w:t xml:space="preserve">The risk of the conditional mean is 1.</w:t>
+      </w:r>
+      <w:r>
+        <w:t xml:space="preserve"> </w:t>
+      </w:r>
+      <w:r>
+        <w:t xml:space="preserve">So the constant prediction has the larger risk.</w:t>
+      </w:r>
+      <w:r>
+        <w:t xml:space="preserve"> </w:t>
+      </w:r>
+      <w:r>
+        <w:t xml:space="preserve">The inequality is strict because the two predictions differ.</w:t>
       </w:r>
     </w:p>
     <w:p>

</xml_diff>

<commit_message>
Deploying to gh-pages from @ Morrison-Lab/psw@92f27e09687e1835db9a71dcd41f9e4dc3eb6e5c 🚀
</commit_message>
<xml_diff>
--- a/chapters/inclusive-writing.docx
+++ b/chapters/inclusive-writing.docx
@@ -15,7 +15,7 @@
         <w:pStyle w:val="Date"/>
       </w:pPr>
       <w:r>
-        <w:t xml:space="preserve">Last modified: 2026-10-19 00:03:25 (PDT)</w:t>
+        <w:t xml:space="preserve">Last modified: 2026-10-19 00:16:56 (PDT)</w:t>
       </w:r>
     </w:p>
     <w:tbl>
@@ -813,6 +813,120 @@
                   </w:pPr>
                   <w:r>
                     <w:t xml:space="preserve">a mean of zero implies one identity</w:t>
+                  </w:r>
+                </w:p>
+              </w:tc>
+            </w:tr>
+            <w:tr>
+              <w:tc>
+                <w:tcPr/>
+                <w:p>
+                  <w:pPr>
+                    <w:pStyle w:val="Compact"/>
+                    <w:jc w:val="center"/>
+                  </w:pPr>
+                  <w:r>
+                    <w:t xml:space="preserve">Fix</w:t>
+                  </w:r>
+                  <w:r>
+                    <w:t xml:space="preserve"> </w:t>
+                  </w:r>
+                  <m:oMath>
+                    <m:r>
+                      <m:t>ε</m:t>
+                    </m:r>
+                    <m:r>
+                      <m:rPr>
+                        <m:sty m:val="p"/>
+                      </m:rPr>
+                      <m:t>&gt;</m:t>
+                    </m:r>
+                    <m:r>
+                      <m:t>0</m:t>
+                    </m:r>
+                  </m:oMath>
+                  <w:r>
+                    <w:t xml:space="preserve">.</w:t>
+                  </w:r>
+                </w:p>
+              </w:tc>
+              <w:tc>
+                <w:tcPr/>
+                <w:p>
+                  <w:pPr>
+                    <w:pStyle w:val="Compact"/>
+                    <w:jc w:val="center"/>
+                  </w:pPr>
+                  <w:r>
+                    <w:t xml:space="preserve">Let</w:t>
+                  </w:r>
+                  <w:r>
+                    <w:t xml:space="preserve"> </w:t>
+                  </w:r>
+                  <m:oMath>
+                    <m:r>
+                      <m:t>ε</m:t>
+                    </m:r>
+                    <m:r>
+                      <m:rPr>
+                        <m:sty m:val="p"/>
+                      </m:rPr>
+                      <m:t>&gt;</m:t>
+                    </m:r>
+                    <m:r>
+                      <m:t>0</m:t>
+                    </m:r>
+                  </m:oMath>
+                  <w:r>
+                    <w:t xml:space="preserve">.</w:t>
+                  </w:r>
+                </w:p>
+              </w:tc>
+            </w:tr>
+            <w:tr>
+              <w:tc>
+                <w:tcPr/>
+                <w:p>
+                  <w:pPr>
+                    <w:pStyle w:val="Compact"/>
+                    <w:jc w:val="center"/>
+                  </w:pPr>
+                  <w:r>
+                    <w:t xml:space="preserve">Fix a value</w:t>
+                  </w:r>
+                  <w:r>
+                    <w:t xml:space="preserve"> </w:t>
+                  </w:r>
+                  <m:oMath>
+                    <m:r>
+                      <m:t>t</m:t>
+                    </m:r>
+                  </m:oMath>
+                  <w:r>
+                    <w:t xml:space="preserve">.</w:t>
+                  </w:r>
+                </w:p>
+              </w:tc>
+              <w:tc>
+                <w:tcPr/>
+                <w:p>
+                  <w:pPr>
+                    <w:pStyle w:val="Compact"/>
+                    <w:jc w:val="center"/>
+                  </w:pPr>
+                  <w:r>
+                    <w:t xml:space="preserve">Choose a value</w:t>
+                  </w:r>
+                  <w:r>
+                    <w:t xml:space="preserve"> </w:t>
+                  </w:r>
+                  <m:oMath>
+                    <m:r>
+                      <m:t>t</m:t>
+                    </m:r>
+                  </m:oMath>
+                  <w:r>
+                    <w:t xml:space="preserve">.</w:t>
                   </w:r>
                 </w:p>
               </w:tc>

</xml_diff>

<commit_message>
Deploying to gh-pages from @ Morrison-Lab/psw@b18cd13e38c5a7b644edbaa6516d3633bbcc9d2b 🚀
</commit_message>
<xml_diff>
--- a/chapters/inclusive-writing.docx
+++ b/chapters/inclusive-writing.docx
@@ -15,7 +15,7 @@
         <w:pStyle w:val="Date"/>
       </w:pPr>
       <w:r>
-        <w:t xml:space="preserve">Last modified: 2026-10-19 01:18:03 (PDT)</w:t>
+        <w:t xml:space="preserve">Last modified: 2026-10-19 02:57:24 (PDT)</w:t>
       </w:r>
     </w:p>
     <w:tbl>
@@ -1009,6 +1009,108 @@
                 </w:p>
               </w:tc>
             </w:tr>
+            <w:tr>
+              <w:tc>
+                <w:tcPr/>
+                <w:p>
+                  <w:pPr>
+                    <w:pStyle w:val="Compact"/>
+                    <w:jc w:val="center"/>
+                  </w:pPr>
+                  <w:r>
+                    <w:t xml:space="preserve">Write the bias of an estimator.</w:t>
+                  </w:r>
+                </w:p>
+              </w:tc>
+              <w:tc>
+                <w:tcPr/>
+                <w:p>
+                  <w:pPr>
+                    <w:pStyle w:val="Compact"/>
+                    <w:jc w:val="center"/>
+                  </w:pPr>
+                  <w:r>
+                    <w:t xml:space="preserve">Derive an expression for the bias of an estimator.</w:t>
+                  </w:r>
+                </w:p>
+              </w:tc>
+            </w:tr>
+            <w:tr>
+              <w:tc>
+                <w:tcPr/>
+                <w:p>
+                  <w:pPr>
+                    <w:pStyle w:val="Compact"/>
+                    <w:jc w:val="center"/>
+                  </w:pPr>
+                  <w:r>
+                    <w:t xml:space="preserve">Write</w:t>
+                  </w:r>
+                  <w:r>
+                    <w:t xml:space="preserve"> </w:t>
+                  </w:r>
+                  <m:oMath>
+                    <m:r>
+                      <m:t>X</m:t>
+                    </m:r>
+                  </m:oMath>
+                  <w:r>
+                    <w:t xml:space="preserve"> </w:t>
+                  </w:r>
+                  <w:r>
+                    <w:t xml:space="preserve">in terms of</w:t>
+                  </w:r>
+                  <w:r>
+                    <w:t xml:space="preserve"> </w:t>
+                  </w:r>
+                  <m:oMath>
+                    <m:r>
+                      <m:t>Y</m:t>
+                    </m:r>
+                  </m:oMath>
+                  <w:r>
+                    <w:t xml:space="preserve">.</w:t>
+                  </w:r>
+                </w:p>
+              </w:tc>
+              <w:tc>
+                <w:tcPr/>
+                <w:p>
+                  <w:pPr>
+                    <w:pStyle w:val="Compact"/>
+                    <w:jc w:val="center"/>
+                  </w:pPr>
+                  <w:r>
+                    <w:t xml:space="preserve">Express</w:t>
+                  </w:r>
+                  <w:r>
+                    <w:t xml:space="preserve"> </w:t>
+                  </w:r>
+                  <m:oMath>
+                    <m:r>
+                      <m:t>X</m:t>
+                    </m:r>
+                  </m:oMath>
+                  <w:r>
+                    <w:t xml:space="preserve"> </w:t>
+                  </w:r>
+                  <w:r>
+                    <w:t xml:space="preserve">in terms of</w:t>
+                  </w:r>
+                  <w:r>
+                    <w:t xml:space="preserve"> </w:t>
+                  </w:r>
+                  <m:oMath>
+                    <m:r>
+                      <m:t>Y</m:t>
+                    </m:r>
+                  </m:oMath>
+                  <w:r>
+                    <w:t xml:space="preserve">.</w:t>
+                  </w:r>
+                </w:p>
+              </w:tc>
+            </w:tr>
           </w:tbl>
           <w:bookmarkEnd w:id="12"/>
           <w:p/>
@@ -1018,6 +1120,143 @@
     <w:p>
       <w:pPr>
         <w:pStyle w:val="BodyText"/>
+      </w:pPr>
+      <w:r>
+        <w:t xml:space="preserve">Mathematical writing has idioms too.</w:t>
+      </w:r>
+      <w:r>
+        <w:t xml:space="preserve"> </w:t>
+      </w:r>
+      <w:r>
+        <w:t xml:space="preserve">In an exercise,</w:t>
+      </w:r>
+      <w:r>
+        <w:t xml:space="preserve"> </w:t>
+      </w:r>
+      <w:r>
+        <w:t xml:space="preserve">“Write the bias of an estimator”</w:t>
+      </w:r>
+      <w:r>
+        <w:t xml:space="preserve"> </w:t>
+      </w:r>
+      <w:r>
+        <w:t xml:space="preserve">means</w:t>
+      </w:r>
+      <w:r>
+        <w:t xml:space="preserve"> </w:t>
+      </w:r>
+      <w:r>
+        <w:t xml:space="preserve">“derive an expression for the bias of an estimator”</w:t>
+      </w:r>
+      <w:r>
+        <w:t xml:space="preserve">.</w:t>
+      </w:r>
+      <w:r>
+        <w:t xml:space="preserve"> </w:t>
+      </w:r>
+      <w:r>
+        <w:t xml:space="preserve">A reader who takes</w:t>
+      </w:r>
+      <w:r>
+        <w:t xml:space="preserve"> </w:t>
+      </w:r>
+      <w:r>
+        <w:t xml:space="preserve">“write”</w:t>
+      </w:r>
+      <w:r>
+        <w:t xml:space="preserve"> </w:t>
+      </w:r>
+      <w:r>
+        <w:t xml:space="preserve">literally</w:t>
+      </w:r>
+      <w:r>
+        <w:t xml:space="preserve"> </w:t>
+      </w:r>
+      <w:r>
+        <w:t xml:space="preserve">may copy the definition instead of deriving the result.</w:t>
+      </w:r>
+      <w:r>
+        <w:t xml:space="preserve"> </w:t>
+      </w:r>
+      <w:r>
+        <w:t xml:space="preserve">Name the action instead:</w:t>
+      </w:r>
+    </w:p>
+    <w:p>
+      <w:pPr>
+        <w:pStyle w:val="Compact"/>
+        <w:numPr>
+          <w:ilvl w:val="0"/>
+          <w:numId w:val="1002"/>
+        </w:numPr>
+      </w:pPr>
+      <w:r>
+        <w:t xml:space="preserve">“derive”</w:t>
+      </w:r>
+      <w:r>
+        <w:t xml:space="preserve"> </w:t>
+      </w:r>
+      <w:r>
+        <w:t xml:space="preserve">for a result the reader must work out;</w:t>
+      </w:r>
+    </w:p>
+    <w:p>
+      <w:pPr>
+        <w:pStyle w:val="Compact"/>
+        <w:numPr>
+          <w:ilvl w:val="0"/>
+          <w:numId w:val="1002"/>
+        </w:numPr>
+      </w:pPr>
+      <w:r>
+        <w:t xml:space="preserve">“express”</w:t>
+      </w:r>
+      <w:r>
+        <w:t xml:space="preserve"> </w:t>
+      </w:r>
+      <w:r>
+        <w:t xml:space="preserve">for a rewrite in terms of other quantities;</w:t>
+      </w:r>
+    </w:p>
+    <w:p>
+      <w:pPr>
+        <w:pStyle w:val="Compact"/>
+        <w:numPr>
+          <w:ilvl w:val="0"/>
+          <w:numId w:val="1002"/>
+        </w:numPr>
+      </w:pPr>
+      <w:r>
+        <w:t xml:space="preserve">“state”</w:t>
+      </w:r>
+      <w:r>
+        <w:t xml:space="preserve"> </w:t>
+      </w:r>
+      <w:r>
+        <w:t xml:space="preserve">for a result the reader recalls;</w:t>
+      </w:r>
+    </w:p>
+    <w:p>
+      <w:pPr>
+        <w:pStyle w:val="Compact"/>
+        <w:numPr>
+          <w:ilvl w:val="0"/>
+          <w:numId w:val="1002"/>
+        </w:numPr>
+      </w:pPr>
+      <w:r>
+        <w:t xml:space="preserve">“give”</w:t>
+      </w:r>
+      <w:r>
+        <w:t xml:space="preserve"> </w:t>
+      </w:r>
+      <w:r>
+        <w:t xml:space="preserve">for a value the reader reads off.</w:t>
+      </w:r>
+    </w:p>
+    <w:p>
+      <w:pPr>
+        <w:pStyle w:val="FirstParagraph"/>
       </w:pPr>
       <w:r>
         <w:t xml:space="preserve">Idioms are a kind of metaphor,</w:t>
@@ -4229,6 +4468,9 @@
     <w:abstractNumId w:val="990"/>
   </w:num>
   <w:num w:numId="1001">
+    <w:abstractNumId w:val="991"/>
+  </w:num>
+  <w:num w:numId="1002">
     <w:abstractNumId w:val="991"/>
   </w:num>
 </w:numbering>

</xml_diff>

<commit_message>
Deploying to gh-pages from @ Morrison-Lab/psw@39e60704c9adfbd8fc65fd62ad0d657635797a21 🚀
</commit_message>
<xml_diff>
--- a/chapters/inclusive-writing.docx
+++ b/chapters/inclusive-writing.docx
@@ -15,7 +15,7 @@
         <w:pStyle w:val="Date"/>
       </w:pPr>
       <w:r>
-        <w:t xml:space="preserve">Last modified: 2026-10-19 23:30:24 (PDT)</w:t>
+        <w:t xml:space="preserve">Last modified: 2026-10-20 00:37:42 (PDT)</w:t>
       </w:r>
     </w:p>
     <w:tbl>
@@ -1107,6 +1107,274 @@
                   </m:oMath>
                   <w:r>
                     <w:t xml:space="preserve">.</w:t>
+                  </w:r>
+                </w:p>
+              </w:tc>
+            </w:tr>
+            <w:tr>
+              <w:tc>
+                <w:tcPr/>
+                <w:p>
+                  <w:pPr>
+                    <w:pStyle w:val="Compact"/>
+                    <w:jc w:val="center"/>
+                  </w:pPr>
+                  <w:r>
+                    <w:t xml:space="preserve">Take a sample of size</w:t>
+                  </w:r>
+                  <w:r>
+                    <w:t xml:space="preserve"> </w:t>
+                  </w:r>
+                  <m:oMath>
+                    <m:r>
+                      <m:t>n</m:t>
+                    </m:r>
+                  </m:oMath>
+                  <w:r>
+                    <w:t xml:space="preserve"> </w:t>
+                  </w:r>
+                  <w:r>
+                    <w:t xml:space="preserve">and call the sample mean</w:t>
+                  </w:r>
+                  <w:r>
+                    <w:t xml:space="preserve"> </w:t>
+                  </w:r>
+                  <m:oMath>
+                    <m:acc>
+                      <m:accPr>
+                        <m:chr m:val="‾"/>
+                      </m:accPr>
+                      <m:e>
+                        <m:r>
+                          <m:t>x</m:t>
+                        </m:r>
+                      </m:e>
+                    </m:acc>
+                  </m:oMath>
+                  <w:r>
+                    <w:t xml:space="preserve">.</w:t>
+                  </w:r>
+                </w:p>
+              </w:tc>
+              <w:tc>
+                <w:tcPr/>
+                <w:p>
+                  <w:pPr>
+                    <w:pStyle w:val="Compact"/>
+                    <w:jc w:val="center"/>
+                  </w:pPr>
+                  <w:r>
+                    <w:t xml:space="preserve">Consider a sample of size</w:t>
+                  </w:r>
+                  <w:r>
+                    <w:t xml:space="preserve"> </w:t>
+                  </w:r>
+                  <m:oMath>
+                    <m:r>
+                      <m:t>n</m:t>
+                    </m:r>
+                  </m:oMath>
+                  <w:r>
+                    <w:t xml:space="preserve"> </w:t>
+                  </w:r>
+                  <w:r>
+                    <w:t xml:space="preserve">and denote the sample mean by</w:t>
+                  </w:r>
+                  <w:r>
+                    <w:t xml:space="preserve"> </w:t>
+                  </w:r>
+                  <m:oMath>
+                    <m:acc>
+                      <m:accPr>
+                        <m:chr m:val="‾"/>
+                      </m:accPr>
+                      <m:e>
+                        <m:r>
+                          <m:t>x</m:t>
+                        </m:r>
+                      </m:e>
+                    </m:acc>
+                  </m:oMath>
+                  <w:r>
+                    <w:t xml:space="preserve">.</w:t>
+                  </w:r>
+                </w:p>
+              </w:tc>
+            </w:tr>
+            <w:tr>
+              <w:tc>
+                <w:tcPr/>
+                <w:p>
+                  <w:pPr>
+                    <w:pStyle w:val="Compact"/>
+                    <w:jc w:val="center"/>
+                  </w:pPr>
+                  <w:r>
+                    <w:t xml:space="preserve">the residual lies in</w:t>
+                  </w:r>
+                  <w:r>
+                    <w:t xml:space="preserve"> </w:t>
+                  </w:r>
+                  <m:oMath>
+                    <m:r>
+                      <m:rPr>
+                        <m:sty m:val="p"/>
+                      </m:rPr>
+                      <m:t>(</m:t>
+                    </m:r>
+                    <m:r>
+                      <m:rPr>
+                        <m:sty m:val="p"/>
+                      </m:rPr>
+                      <m:t>−</m:t>
+                    </m:r>
+                    <m:r>
+                      <m:t>1</m:t>
+                    </m:r>
+                    <m:r>
+                      <m:rPr>
+                        <m:sty m:val="p"/>
+                      </m:rPr>
+                      <m:t>,</m:t>
+                    </m:r>
+                    <m:r>
+                      <m:t>1</m:t>
+                    </m:r>
+                    <m:r>
+                      <m:rPr>
+                        <m:sty m:val="p"/>
+                      </m:rPr>
+                      <m:t>)</m:t>
+                    </m:r>
+                  </m:oMath>
+                </w:p>
+              </w:tc>
+              <w:tc>
+                <w:tcPr/>
+                <w:p>
+                  <w:pPr>
+                    <w:pStyle w:val="Compact"/>
+                    <w:jc w:val="center"/>
+                  </w:pPr>
+                  <w:r>
+                    <w:t xml:space="preserve">the residual is in</w:t>
+                  </w:r>
+                  <w:r>
+                    <w:t xml:space="preserve"> </w:t>
+                  </w:r>
+                  <m:oMath>
+                    <m:r>
+                      <m:rPr>
+                        <m:sty m:val="p"/>
+                      </m:rPr>
+                      <m:t>(</m:t>
+                    </m:r>
+                    <m:r>
+                      <m:rPr>
+                        <m:sty m:val="p"/>
+                      </m:rPr>
+                      <m:t>−</m:t>
+                    </m:r>
+                    <m:r>
+                      <m:t>1</m:t>
+                    </m:r>
+                    <m:r>
+                      <m:rPr>
+                        <m:sty m:val="p"/>
+                      </m:rPr>
+                      <m:t>,</m:t>
+                    </m:r>
+                    <m:r>
+                      <m:t>1</m:t>
+                    </m:r>
+                    <m:r>
+                      <m:rPr>
+                        <m:sty m:val="p"/>
+                      </m:rPr>
+                      <m:t>)</m:t>
+                    </m:r>
+                  </m:oMath>
+                </w:p>
+              </w:tc>
+            </w:tr>
+            <w:tr>
+              <w:tc>
+                <w:tcPr/>
+                <w:p>
+                  <w:pPr>
+                    <w:pStyle w:val="Compact"/>
+                    <w:jc w:val="center"/>
+                  </w:pPr>
+                  <w:r>
+                    <w:t xml:space="preserve">the certain distribution sits at</w:t>
+                  </w:r>
+                  <w:r>
+                    <w:t xml:space="preserve"> </w:t>
+                  </w:r>
+                  <m:oMath>
+                    <m:r>
+                      <m:t>0</m:t>
+                    </m:r>
+                  </m:oMath>
+                  <w:r>
+                    <w:t xml:space="preserve">, the uniform distribution at</w:t>
+                  </w:r>
+                  <w:r>
+                    <w:t xml:space="preserve"> </w:t>
+                  </w:r>
+                  <m:oMath>
+                    <m:r>
+                      <m:rPr>
+                        <m:sty m:val="p"/>
+                      </m:rPr>
+                      <m:t>log</m:t>
+                    </m:r>
+                    <m:r>
+                      <m:t>4</m:t>
+                    </m:r>
+                  </m:oMath>
+                  <w:r>
+                    <w:t xml:space="preserve">, and the skewed distribution lies between them</w:t>
+                  </w:r>
+                </w:p>
+              </w:tc>
+              <w:tc>
+                <w:tcPr/>
+                <w:p>
+                  <w:pPr>
+                    <w:pStyle w:val="Compact"/>
+                    <w:jc w:val="center"/>
+                  </w:pPr>
+                  <w:r>
+                    <w:t xml:space="preserve">the certain distribution has entropy</w:t>
+                  </w:r>
+                  <w:r>
+                    <w:t xml:space="preserve"> </w:t>
+                  </w:r>
+                  <m:oMath>
+                    <m:r>
+                      <m:t>0</m:t>
+                    </m:r>
+                  </m:oMath>
+                  <w:r>
+                    <w:t xml:space="preserve">, the uniform distribution has entropy</w:t>
+                  </w:r>
+                  <w:r>
+                    <w:t xml:space="preserve"> </w:t>
+                  </w:r>
+                  <m:oMath>
+                    <m:r>
+                      <m:rPr>
+                        <m:sty m:val="p"/>
+                      </m:rPr>
+                      <m:t>log</m:t>
+                    </m:r>
+                    <m:r>
+                      <m:t>4</m:t>
+                    </m:r>
+                  </m:oMath>
+                  <w:r>
+                    <w:t xml:space="preserve">, and the skewed distribution has entropy between those two values</w:t>
                   </w:r>
                 </w:p>
               </w:tc>

</xml_diff>

<commit_message>
Deploying to gh-pages from @ Morrison-Lab/psw@67bc85743c60025e08526b6bd9c337323662bec3 🚀
</commit_message>
<xml_diff>
--- a/chapters/inclusive-writing.docx
+++ b/chapters/inclusive-writing.docx
@@ -15,7 +15,7 @@
         <w:pStyle w:val="Date"/>
       </w:pPr>
       <w:r>
-        <w:t xml:space="preserve">Last modified: 2026-10-20 00:37:42 (PDT)</w:t>
+        <w:t xml:space="preserve">Last modified: 2026-10-20 10:34:33 (PDT)</w:t>
       </w:r>
     </w:p>
     <w:tbl>
@@ -1379,6 +1379,452 @@
                 </w:p>
               </w:tc>
             </w:tr>
+            <w:tr>
+              <w:tc>
+                <w:tcPr/>
+                <w:p>
+                  <w:pPr>
+                    <w:pStyle w:val="Compact"/>
+                    <w:jc w:val="center"/>
+                  </w:pPr>
+                  <w:r>
+                    <w:t xml:space="preserve">the two discriminant scores agree at</w:t>
+                  </w:r>
+                  <w:r>
+                    <w:t xml:space="preserve"> </w:t>
+                  </w:r>
+                  <m:oMath>
+                    <m:r>
+                      <m:t>x</m:t>
+                    </m:r>
+                  </m:oMath>
+                </w:p>
+              </w:tc>
+              <w:tc>
+                <w:tcPr/>
+                <w:p>
+                  <w:pPr>
+                    <w:pStyle w:val="Compact"/>
+                    <w:jc w:val="center"/>
+                  </w:pPr>
+                  <w:r>
+                    <w:t xml:space="preserve">the two discriminant scores are equal at</w:t>
+                  </w:r>
+                  <w:r>
+                    <w:t xml:space="preserve"> </w:t>
+                  </w:r>
+                  <m:oMath>
+                    <m:r>
+                      <m:t>x</m:t>
+                    </m:r>
+                  </m:oMath>
+                </w:p>
+              </w:tc>
+            </w:tr>
+            <w:tr>
+              <w:tc>
+                <w:tcPr/>
+                <w:p>
+                  <w:pPr>
+                    <w:pStyle w:val="Compact"/>
+                    <w:jc w:val="center"/>
+                  </w:pPr>
+                  <w:r>
+                    <w:t xml:space="preserve">the derivative vanishes at</w:t>
+                  </w:r>
+                  <w:r>
+                    <w:t xml:space="preserve"> </w:t>
+                  </w:r>
+                  <m:oMath>
+                    <m:acc>
+                      <m:accPr>
+                        <m:chr m:val="̂"/>
+                      </m:accPr>
+                      <m:e>
+                        <m:r>
+                          <m:t>θ</m:t>
+                        </m:r>
+                      </m:e>
+                    </m:acc>
+                  </m:oMath>
+                </w:p>
+              </w:tc>
+              <w:tc>
+                <w:tcPr/>
+                <w:p>
+                  <w:pPr>
+                    <w:pStyle w:val="Compact"/>
+                    <w:jc w:val="center"/>
+                  </w:pPr>
+                  <w:r>
+                    <w:t xml:space="preserve">the derivative equals</w:t>
+                  </w:r>
+                  <w:r>
+                    <w:t xml:space="preserve"> </w:t>
+                  </w:r>
+                  <m:oMath>
+                    <m:r>
+                      <m:t>0</m:t>
+                    </m:r>
+                  </m:oMath>
+                  <w:r>
+                    <w:t xml:space="preserve"> </w:t>
+                  </w:r>
+                  <w:r>
+                    <w:t xml:space="preserve">at</w:t>
+                  </w:r>
+                  <w:r>
+                    <w:t xml:space="preserve"> </w:t>
+                  </w:r>
+                  <m:oMath>
+                    <m:acc>
+                      <m:accPr>
+                        <m:chr m:val="̂"/>
+                      </m:accPr>
+                      <m:e>
+                        <m:r>
+                          <m:t>θ</m:t>
+                        </m:r>
+                      </m:e>
+                    </m:acc>
+                  </m:oMath>
+                </w:p>
+              </w:tc>
+            </w:tr>
+            <w:tr>
+              <w:tc>
+                <w:tcPr/>
+                <w:p>
+                  <w:pPr>
+                    <w:pStyle w:val="Compact"/>
+                    <w:jc w:val="center"/>
+                  </w:pPr>
+                  <w:r>
+                    <w:t xml:space="preserve">setting</w:t>
+                  </w:r>
+                  <w:r>
+                    <w:t xml:space="preserve"> </w:t>
+                  </w:r>
+                  <m:oMath>
+                    <m:r>
+                      <m:t>K</m:t>
+                    </m:r>
+                    <m:r>
+                      <m:rPr>
+                        <m:sty m:val="p"/>
+                      </m:rPr>
+                      <m:t>=</m:t>
+                    </m:r>
+                    <m:r>
+                      <m:t>2</m:t>
+                    </m:r>
+                  </m:oMath>
+                  <w:r>
+                    <w:t xml:space="preserve"> </w:t>
+                  </w:r>
+                  <w:r>
+                    <w:t xml:space="preserve">recovers the binary log-odds</w:t>
+                  </w:r>
+                </w:p>
+              </w:tc>
+              <w:tc>
+                <w:tcPr/>
+                <w:p>
+                  <w:pPr>
+                    <w:pStyle w:val="Compact"/>
+                    <w:jc w:val="center"/>
+                  </w:pPr>
+                  <w:r>
+                    <w:t xml:space="preserve">setting</w:t>
+                  </w:r>
+                  <w:r>
+                    <w:t xml:space="preserve"> </w:t>
+                  </w:r>
+                  <m:oMath>
+                    <m:r>
+                      <m:t>K</m:t>
+                    </m:r>
+                    <m:r>
+                      <m:rPr>
+                        <m:sty m:val="p"/>
+                      </m:rPr>
+                      <m:t>=</m:t>
+                    </m:r>
+                    <m:r>
+                      <m:t>2</m:t>
+                    </m:r>
+                  </m:oMath>
+                  <w:r>
+                    <w:t xml:space="preserve"> </w:t>
+                  </w:r>
+                  <w:r>
+                    <w:t xml:space="preserve">gives the binary log-odds</w:t>
+                  </w:r>
+                </w:p>
+              </w:tc>
+            </w:tr>
+            <w:tr>
+              <w:tc>
+                <w:tcPr/>
+                <w:p>
+                  <w:pPr>
+                    <w:pStyle w:val="Compact"/>
+                    <w:jc w:val="center"/>
+                  </w:pPr>
+                  <w:r>
+                    <w:t xml:space="preserve">the probability</w:t>
+                  </w:r>
+                  <w:r>
+                    <w:t xml:space="preserve"> </w:t>
+                  </w:r>
+                  <m:oMath>
+                    <m:r>
+                      <m:t>p</m:t>
+                    </m:r>
+                  </m:oMath>
+                  <w:r>
+                    <w:t xml:space="preserve"> </w:t>
+                  </w:r>
+                  <w:r>
+                    <w:t xml:space="preserve">lives in</w:t>
+                  </w:r>
+                  <w:r>
+                    <w:t xml:space="preserve"> </w:t>
+                  </w:r>
+                  <m:oMath>
+                    <m:r>
+                      <m:rPr>
+                        <m:sty m:val="p"/>
+                      </m:rPr>
+                      <m:t>(</m:t>
+                    </m:r>
+                    <m:r>
+                      <m:t>0</m:t>
+                    </m:r>
+                    <m:r>
+                      <m:rPr>
+                        <m:sty m:val="p"/>
+                      </m:rPr>
+                      <m:t>,</m:t>
+                    </m:r>
+                    <m:r>
+                      <m:t>1</m:t>
+                    </m:r>
+                    <m:r>
+                      <m:rPr>
+                        <m:sty m:val="p"/>
+                      </m:rPr>
+                      <m:t>)</m:t>
+                    </m:r>
+                  </m:oMath>
+                </w:p>
+              </w:tc>
+              <w:tc>
+                <w:tcPr/>
+                <w:p>
+                  <w:pPr>
+                    <w:pStyle w:val="Compact"/>
+                    <w:jc w:val="center"/>
+                  </w:pPr>
+                  <w:r>
+                    <w:t xml:space="preserve">the probability</w:t>
+                  </w:r>
+                  <w:r>
+                    <w:t xml:space="preserve"> </w:t>
+                  </w:r>
+                  <m:oMath>
+                    <m:r>
+                      <m:t>p</m:t>
+                    </m:r>
+                  </m:oMath>
+                  <w:r>
+                    <w:t xml:space="preserve"> </w:t>
+                  </w:r>
+                  <w:r>
+                    <w:t xml:space="preserve">is in</w:t>
+                  </w:r>
+                  <w:r>
+                    <w:t xml:space="preserve"> </w:t>
+                  </w:r>
+                  <m:oMath>
+                    <m:r>
+                      <m:rPr>
+                        <m:sty m:val="p"/>
+                      </m:rPr>
+                      <m:t>(</m:t>
+                    </m:r>
+                    <m:r>
+                      <m:t>0</m:t>
+                    </m:r>
+                    <m:r>
+                      <m:rPr>
+                        <m:sty m:val="p"/>
+                      </m:rPr>
+                      <m:t>,</m:t>
+                    </m:r>
+                    <m:r>
+                      <m:t>1</m:t>
+                    </m:r>
+                    <m:r>
+                      <m:rPr>
+                        <m:sty m:val="p"/>
+                      </m:rPr>
+                      <m:t>)</m:t>
+                    </m:r>
+                  </m:oMath>
+                </w:p>
+              </w:tc>
+            </w:tr>
+            <w:tr>
+              <w:tc>
+                <w:tcPr/>
+                <w:p>
+                  <w:pPr>
+                    <w:pStyle w:val="Compact"/>
+                    <w:jc w:val="center"/>
+                  </w:pPr>
+                  <w:r>
+                    <w:t xml:space="preserve">the linear model knows nothing about the range</w:t>
+                  </w:r>
+                  <w:r>
+                    <w:t xml:space="preserve"> </w:t>
+                  </w:r>
+                  <m:oMath>
+                    <m:r>
+                      <m:rPr>
+                        <m:sty m:val="p"/>
+                      </m:rPr>
+                      <m:t>[</m:t>
+                    </m:r>
+                    <m:r>
+                      <m:t>0</m:t>
+                    </m:r>
+                    <m:r>
+                      <m:rPr>
+                        <m:sty m:val="p"/>
+                      </m:rPr>
+                      <m:t>,</m:t>
+                    </m:r>
+                    <m:r>
+                      <m:t>1</m:t>
+                    </m:r>
+                    <m:r>
+                      <m:rPr>
+                        <m:sty m:val="p"/>
+                      </m:rPr>
+                      <m:t>]</m:t>
+                    </m:r>
+                  </m:oMath>
+                </w:p>
+              </w:tc>
+              <w:tc>
+                <w:tcPr/>
+                <w:p>
+                  <w:pPr>
+                    <w:pStyle w:val="Compact"/>
+                    <w:jc w:val="center"/>
+                  </w:pPr>
+                  <w:r>
+                    <w:t xml:space="preserve">the linear model does not constrain predictions to</w:t>
+                  </w:r>
+                  <w:r>
+                    <w:t xml:space="preserve"> </w:t>
+                  </w:r>
+                  <m:oMath>
+                    <m:r>
+                      <m:rPr>
+                        <m:sty m:val="p"/>
+                      </m:rPr>
+                      <m:t>[</m:t>
+                    </m:r>
+                    <m:r>
+                      <m:t>0</m:t>
+                    </m:r>
+                    <m:r>
+                      <m:rPr>
+                        <m:sty m:val="p"/>
+                      </m:rPr>
+                      <m:t>,</m:t>
+                    </m:r>
+                    <m:r>
+                      <m:t>1</m:t>
+                    </m:r>
+                    <m:r>
+                      <m:rPr>
+                        <m:sty m:val="p"/>
+                      </m:rPr>
+                      <m:t>]</m:t>
+                    </m:r>
+                  </m:oMath>
+                </w:p>
+              </w:tc>
+            </w:tr>
+            <w:tr>
+              <w:tc>
+                <w:tcPr/>
+                <w:p>
+                  <w:pPr>
+                    <w:pStyle w:val="Compact"/>
+                    <w:jc w:val="center"/>
+                  </w:pPr>
+                  <w:r>
+                    <w:t xml:space="preserve">Say which class the classifier predicts at</w:t>
+                  </w:r>
+                  <w:r>
+                    <w:t xml:space="preserve"> </w:t>
+                  </w:r>
+                  <m:oMath>
+                    <m:r>
+                      <m:t>x</m:t>
+                    </m:r>
+                    <m:r>
+                      <m:rPr>
+                        <m:sty m:val="p"/>
+                      </m:rPr>
+                      <m:t>=</m:t>
+                    </m:r>
+                    <m:r>
+                      <m:t>2</m:t>
+                    </m:r>
+                  </m:oMath>
+                  <w:r>
+                    <w:t xml:space="preserve">.</w:t>
+                  </w:r>
+                </w:p>
+              </w:tc>
+              <w:tc>
+                <w:tcPr/>
+                <w:p>
+                  <w:pPr>
+                    <w:pStyle w:val="Compact"/>
+                    <w:jc w:val="center"/>
+                  </w:pPr>
+                  <w:r>
+                    <w:t xml:space="preserve">State which class the classifier predicts at</w:t>
+                  </w:r>
+                  <w:r>
+                    <w:t xml:space="preserve"> </w:t>
+                  </w:r>
+                  <m:oMath>
+                    <m:r>
+                      <m:t>x</m:t>
+                    </m:r>
+                    <m:r>
+                      <m:rPr>
+                        <m:sty m:val="p"/>
+                      </m:rPr>
+                      <m:t>=</m:t>
+                    </m:r>
+                    <m:r>
+                      <m:t>2</m:t>
+                    </m:r>
+                  </m:oMath>
+                  <w:r>
+                    <w:t xml:space="preserve">.</w:t>
+                  </w:r>
+                </w:p>
+              </w:tc>
+            </w:tr>
           </w:tbl>
           <w:bookmarkEnd w:id="12"/>
           <w:p/>
@@ -1417,6 +1863,33 @@
         <w:t xml:space="preserve">“derive an expression for the bias of an estimator”</w:t>
       </w:r>
       <w:r>
+        <w:t xml:space="preserve">,</w:t>
+      </w:r>
+      <w:r>
+        <w:t xml:space="preserve"> </w:t>
+      </w:r>
+      <w:r>
+        <w:t xml:space="preserve">and</w:t>
+      </w:r>
+      <w:r>
+        <w:t xml:space="preserve"> </w:t>
+      </w:r>
+      <w:r>
+        <w:t xml:space="preserve">“Say which estimator has smaller variance”</w:t>
+      </w:r>
+      <w:r>
+        <w:t xml:space="preserve"> </w:t>
+      </w:r>
+      <w:r>
+        <w:t xml:space="preserve">means</w:t>
+      </w:r>
+      <w:r>
+        <w:t xml:space="preserve"> </w:t>
+      </w:r>
+      <w:r>
+        <w:t xml:space="preserve">“state which estimator has smaller variance”</w:t>
+      </w:r>
+      <w:r>
         <w:t xml:space="preserve">.</w:t>
       </w:r>
       <w:r>
@@ -1435,13 +1908,31 @@
         <w:t xml:space="preserve"> </w:t>
       </w:r>
       <w:r>
+        <w:t xml:space="preserve">or</w:t>
+      </w:r>
+      <w:r>
+        <w:t xml:space="preserve"> </w:t>
+      </w:r>
+      <w:r>
+        <w:t xml:space="preserve">“say”</w:t>
+      </w:r>
+      <w:r>
+        <w:t xml:space="preserve"> </w:t>
+      </w:r>
+      <w:r>
         <w:t xml:space="preserve">literally</w:t>
       </w:r>
       <w:r>
         <w:t xml:space="preserve"> </w:t>
       </w:r>
       <w:r>
-        <w:t xml:space="preserve">may copy the definition instead of deriving the result.</w:t>
+        <w:t xml:space="preserve">may copy the definition or give an informal remark</w:t>
+      </w:r>
+      <w:r>
+        <w:t xml:space="preserve"> </w:t>
+      </w:r>
+      <w:r>
+        <w:t xml:space="preserve">instead of deriving or stating the result.</w:t>
       </w:r>
       <w:r>
         <w:t xml:space="preserve"> </w:t>

</xml_diff>